<commit_message>
docs: unificar fecha de uso de IA y completar revisión humana
</commit_message>
<xml_diff>
--- a/docs/Documento_Decisiones_Diseno_AC2.docx
+++ b/docs/Documento_Decisiones_Diseno_AC2.docx
@@ -5682,7 +5682,79 @@
                 <w:sz w:val="20"/>
                 <w:szCs w:val="20"/>
               </w:rPr>
-              <w:t xml:space="preserve">[COMPLETAR: describir qué revisaron, ejecutaron y modificaron por cuenta propia]</w:t>
+              <w:t xml:space="preserve">Los integrantes ejecutaron </w:t>
+            </w:r>
+            <w:r>
+              <w:rPr>
+                <w:rFonts w:ascii="Consolas" w:cs="Consolas" w:eastAsia="Consolas" w:hAnsi="Consolas"/>
+                <w:b w:val="false"/>
+                <w:bCs w:val="false"/>
+                <w:sz w:val="20"/>
+                <w:szCs w:val="20"/>
+              </w:rPr>
+              <w:t xml:space="preserve">main.py</w:t>
+            </w:r>
+            <w:r>
+              <w:rPr>
+                <w:rFonts w:ascii="Calibri" w:cs="Calibri" w:eastAsia="Calibri" w:hAnsi="Calibri"/>
+                <w:sz w:val="20"/>
+                <w:szCs w:val="20"/>
+              </w:rPr>
+              <w:t xml:space="preserve"> y verificaron su salida completa. Comprobaron el funcionamiento de la clase abstracta </w:t>
+            </w:r>
+            <w:r>
+              <w:rPr>
+                <w:rFonts w:ascii="Consolas" w:cs="Consolas" w:eastAsia="Consolas" w:hAnsi="Consolas"/>
+                <w:b w:val="false"/>
+                <w:bCs w:val="false"/>
+                <w:sz w:val="20"/>
+                <w:szCs w:val="20"/>
+              </w:rPr>
+              <w:t xml:space="preserve">Persona</w:t>
+            </w:r>
+            <w:r>
+              <w:rPr>
+                <w:rFonts w:ascii="Calibri" w:cs="Calibri" w:eastAsia="Calibri" w:hAnsi="Calibri"/>
+                <w:sz w:val="20"/>
+                <w:szCs w:val="20"/>
+              </w:rPr>
+              <w:t xml:space="preserve"> (que no puede instanciarse y que las subclases implementan el método abstracto), de la composición entre </w:t>
+            </w:r>
+            <w:r>
+              <w:rPr>
+                <w:rFonts w:ascii="Consolas" w:cs="Consolas" w:eastAsia="Consolas" w:hAnsi="Consolas"/>
+                <w:b w:val="false"/>
+                <w:bCs w:val="false"/>
+                <w:sz w:val="20"/>
+                <w:szCs w:val="20"/>
+              </w:rPr>
+              <w:t xml:space="preserve">GrupoAcademico</w:t>
+            </w:r>
+            <w:r>
+              <w:rPr>
+                <w:rFonts w:ascii="Calibri" w:cs="Calibri" w:eastAsia="Calibri" w:hAnsi="Calibri"/>
+                <w:sz w:val="20"/>
+                <w:szCs w:val="20"/>
+              </w:rPr>
+              <w:t xml:space="preserve"> y </w:t>
+            </w:r>
+            <w:r>
+              <w:rPr>
+                <w:rFonts w:ascii="Consolas" w:cs="Consolas" w:eastAsia="Consolas" w:hAnsi="Consolas"/>
+                <w:b w:val="false"/>
+                <w:bCs w:val="false"/>
+                <w:sz w:val="20"/>
+                <w:szCs w:val="20"/>
+              </w:rPr>
+              <w:t xml:space="preserve">Horario</w:t>
+            </w:r>
+            <w:r>
+              <w:rPr>
+                <w:rFonts w:ascii="Calibri" w:cs="Calibri" w:eastAsia="Calibri" w:hAnsi="Calibri"/>
+                <w:sz w:val="20"/>
+                <w:szCs w:val="20"/>
+              </w:rPr>
+              <w:t xml:space="preserve">, y de las cinco excepciones personalizadas, confirmando que el programa continúa su ejecución después de capturar cada una.</w:t>
             </w:r>
           </w:p>
         </w:tc>

</xml_diff>

<commit_message>
docs: dejar el proyecto como entrega individual
</commit_message>
<xml_diff>
--- a/docs/Documento_Decisiones_Diseno_AC2.docx
+++ b/docs/Documento_Decisiones_Diseno_AC2.docx
@@ -121,7 +121,7 @@
           <w:sz w:val="26"/>
           <w:szCs w:val="26"/>
         </w:rPr>
-        <w:t xml:space="preserve">Integrantes</w:t>
+        <w:t xml:space="preserve">Autor</w:t>
       </w:r>
     </w:p>
     <w:p>
@@ -136,20 +136,6 @@
           <w:szCs w:val="22"/>
         </w:rPr>
         <w:t xml:space="preserve">Juan Esteban Romero Mosquera — Código 82202524107</w:t>
-      </w:r>
-    </w:p>
-    <w:p>
-      <w:pPr>
-        <w:spacing w:after="120"/>
-        <w:jc w:val="center"/>
-      </w:pPr>
-      <w:r>
-        <w:rPr>
-          <w:rFonts w:ascii="Calibri" w:cs="Calibri" w:eastAsia="Calibri" w:hAnsi="Calibri"/>
-          <w:sz w:val="22"/>
-          <w:szCs w:val="22"/>
-        </w:rPr>
-        <w:t xml:space="preserve">Geidy Nataly Vasquez Lopez</w:t>
       </w:r>
     </w:p>
     <w:p>
@@ -5177,7 +5163,7 @@
           <w:sz w:val="22"/>
           <w:szCs w:val="22"/>
         </w:rPr>
-        <w:t xml:space="preserve">En cumplimiento de los lineamientos de la Universidad de Manizales, los integrantes declaran el uso de herramientas de inteligencia artificial en esta actividad:</w:t>
+        <w:t xml:space="preserve">En cumplimiento de los lineamientos de la Universidad de Manizales, el autor declara el uso de herramientas de inteligencia artificial en esta actividad:</w:t>
       </w:r>
     </w:p>
     <w:tbl>
@@ -5682,7 +5668,7 @@
                 <w:sz w:val="20"/>
                 <w:szCs w:val="20"/>
               </w:rPr>
-              <w:t xml:space="preserve">Los integrantes ejecutaron </w:t>
+              <w:t xml:space="preserve">El autor ejecutó </w:t>
             </w:r>
             <w:r>
               <w:rPr>
@@ -5700,7 +5686,7 @@
                 <w:sz w:val="20"/>
                 <w:szCs w:val="20"/>
               </w:rPr>
-              <w:t xml:space="preserve"> y verificaron su salida completa. Comprobaron el funcionamiento de la clase abstracta </w:t>
+              <w:t xml:space="preserve"> y verificó su salida completa. Comprobó el funcionamiento de la clase abstracta </w:t>
             </w:r>
             <w:r>
               <w:rPr>
@@ -5776,7 +5762,7 @@
           <w:sz w:val="22"/>
           <w:szCs w:val="22"/>
         </w:rPr>
-        <w:t xml:space="preserve">Los integrantes declaran que comprenden el funcionamiento de todo el código entregado y pueden explicarlo y justificarlo; que la herramienta se usó como apoyo y no como sustituto del trabajo académico propio; y que aceptan una actividad adicional de verificación si la Universidad la solicita.</w:t>
+        <w:t xml:space="preserve">El autor declara que comprende el funcionamiento de todo el código entregado y puede explicarlo y justificarlo; que la herramienta se usó como apoyo y no como sustituto del trabajo académico propio; y que acepta una actividad adicional de verificación si la Universidad la solicita.</w:t>
       </w:r>
     </w:p>
     <w:p>
@@ -5795,7 +5781,7 @@
           <w:sz w:val="22"/>
           <w:szCs w:val="22"/>
         </w:rPr>
-        <w:t xml:space="preserve">Firmas de los integrantes:</w:t>
+        <w:t xml:space="preserve">Firma del autor:</w:t>
       </w:r>
     </w:p>
     <w:p>
@@ -5810,20 +5796,6 @@
           <w:szCs w:val="22"/>
         </w:rPr>
         <w:t xml:space="preserve">______________________________  Juan Esteban Romero Mosquera</w:t>
-      </w:r>
-    </w:p>
-    <w:p>
-      <w:pPr>
-        <w:spacing w:after="140" w:line="276"/>
-        <w:jc w:val="left"/>
-      </w:pPr>
-      <w:r>
-        <w:rPr>
-          <w:rFonts w:ascii="Calibri" w:cs="Calibri" w:eastAsia="Calibri" w:hAnsi="Calibri"/>
-          <w:sz w:val="22"/>
-          <w:szCs w:val="22"/>
-        </w:rPr>
-        <w:t xml:space="preserve">______________________________  Geidy Nataly Vasquez Lopez</w:t>
       </w:r>
     </w:p>
     <w:sectPr>

</xml_diff>